<commit_message>
Display Grade 6 questions and answers beside zoomable book page
</commit_message>
<xml_diff>
--- a/Term-1/Grade-6/Unit-1-Revision-Leisure-and-Free-Time/Grade-6-Unit-1-Revision-Lesson-Plan.docx
+++ b/Term-1/Grade-6/Unit-1-Revision-Leisure-and-Free-Time/Grade-6-Unit-1-Revision-Lesson-Plan.docx
@@ -917,7 +917,7 @@
                 <w:rFonts w:ascii="Arial" w:hAnsi="Arial"/>
                 <w:sz w:val="20"/>
               </w:rPr>
-              <w:t>15 mins</w:t>
+              <w:t>14 mins</w:t>
             </w:r>
           </w:p>
         </w:tc>
@@ -1295,7 +1295,7 @@
                 <w:rFonts w:ascii="Arial" w:hAnsi="Arial"/>
                 <w:sz w:val="20"/>
               </w:rPr>
-              <w:t>25 mins</w:t>
+              <w:t>26 mins</w:t>
             </w:r>
           </w:p>
         </w:tc>

</xml_diff>

<commit_message>
Expand Grade 6 revision lesson plan activity procedures
</commit_message>
<xml_diff>
--- a/Term-1/Grade-6/Unit-1-Revision-Leisure-and-Free-Time/Grade-6-Unit-1-Revision-Lesson-Plan.docx
+++ b/Term-1/Grade-6/Unit-1-Revision-Leisure-and-Free-Time/Grade-6-Unit-1-Revision-Lesson-Plan.docx
@@ -937,9 +937,7 @@
               </w:rPr>
               <w:t>Silent reading (10 min): Students read quietly in Kutubi while the teacher prepares the board; no questions.</w:t>
               <w:br/>
-              <w:t>Picture dictionary (3 min): Match leisure words with pictures and meanings.</w:t>
-              <w:br/>
-              <w:t>Read aloud (2 min): Pronounce the word box from page 25.</w:t>
+              <w:t>Picture dictionary (4 min): Match seven leisure words with pictures, say each word, and explain it to a partner.</w:t>
             </w:r>
           </w:p>
         </w:tc>
@@ -1313,15 +1311,15 @@
                 <w:rFonts w:ascii="Arial" w:hAnsi="Arial"/>
                 <w:sz w:val="17"/>
               </w:rPr>
-              <w:t>Vocabulary Activity 1 (5 min): Complete six sentences using the word box; one word is unused.</w:t>
+              <w:t>Activity 1 · Vocabulary (5 min): Teacher points to the book word box. Students read the seven words aloud, use context clues to complete six sentences, and compare with a partner. One word is unused. Reveal each answer on the enlarged book picture after students explain their choice.</w:t>
               <w:br/>
-              <w:t>Past simple Activity 2 (7 min): Model go → went and cook → cooked, then complete six gaps.</w:t>
+              <w:t>Activity 2 · Past simple (7 min): Teacher models a finished action with go → went and cook → cooked. Students complete the six verbs independently, then compare in pairs. Ask why each past form is correct; reveal answers one by one.</w:t>
               <w:br/>
-              <w:t>Regular/irregular Activity 3 (4 min): Write past forms and classify R/I.</w:t>
+              <w:t>Activity 3 · Verb types (4 min): Students write did, saw, had, ate, and played, then label each R or I. Invite students to explain why played is regular.</w:t>
               <w:br/>
-              <w:t>Reordering Activity 4 (4 min): Build four past simple questions.</w:t>
+              <w:t>Activity 4 · Questions (4 min): Pairs reorder four sets of words into questions. Students read the questions aloud; teacher checks did/was and word order before revealing each answer.</w:t>
               <w:br/>
-              <w:t>Amusement park vocabulary (6 min): Unscramble the words in Book Activity 6 and sort activities/food in Book Activity 7. Check answers one at a time.</w:t>
+              <w:t>Book Activities 6–7 · Amusement park words (6 min): Students unscramble six words, check spelling with a partner, then sort them under Activities or Food. Ask students to justify one classification.</w:t>
             </w:r>
           </w:p>
         </w:tc>
@@ -1915,7 +1913,7 @@
                 <w:rFonts w:ascii="Arial" w:hAnsi="Arial"/>
                 <w:sz w:val="18"/>
               </w:rPr>
-              <w:t>Writing (2 min): Complete Activity 8 with original ideas. Exit (3 min): Co-write a short vacation email using the book Activity 10 prompt; students then write their own version.</w:t>
+              <w:t>Activity 8 (2 min): Students finish four sentence starters with their own ideas in notebooks; accept different sensible answers. Exit / Activity 10 (3 min): Teacher and class build a short vacation email with greeting, place, action, feeling, and closing. Reveal each line on the enlarged book page; students begin their own version.</w:t>
             </w:r>
           </w:p>
         </w:tc>

</xml_diff>